<commit_message>
Update Botium Toys audit documents
</commit_message>
<xml_diff>
--- a/01-security-audits/botium-toys-internal-audit/source-materials/Controls and compliance checklist.docx
+++ b/01-security-audits/botium-toys-internal-audit/source-materials/Controls and compliance checklist.docx
@@ -592,7 +592,6 @@
             </w:pPr>
             <w:r>
               <w:rPr>
-                <w:strike w:val="1"/>
                 <w:rtl w:val="0"/>
               </w:rPr>
             </w:r>
@@ -627,6 +626,7 @@
             </w:pPr>
             <w:r>
               <w:rPr>
+                <w:strike w:val="1"/>
                 <w:rtl w:val="0"/>
               </w:rPr>
             </w:r>
@@ -1234,7 +1234,6 @@
             </w:pPr>
             <w:r>
               <w:rPr>
-                <w:strike w:val="1"/>
                 <w:rtl w:val="0"/>
               </w:rPr>
             </w:r>
@@ -1269,6 +1268,7 @@
             </w:pPr>
             <w:r>
               <w:rPr>
+                <w:strike w:val="1"/>
                 <w:rtl w:val="0"/>
               </w:rPr>
             </w:r>
@@ -2356,7 +2356,6 @@
             </w:pPr>
             <w:r>
               <w:rPr>
-                <w:strike w:val="1"/>
                 <w:rtl w:val="0"/>
               </w:rPr>
             </w:r>
@@ -2391,6 +2390,7 @@
             </w:pPr>
             <w:r>
               <w:rPr>
+                <w:strike w:val="1"/>
                 <w:rtl w:val="0"/>
               </w:rPr>
             </w:r>
@@ -3829,7 +3829,6 @@
             </w:pPr>
             <w:r>
               <w:rPr>
-                <w:strike w:val="1"/>
                 <w:rtl w:val="0"/>
               </w:rPr>
             </w:r>
@@ -3864,6 +3863,7 @@
             </w:pPr>
             <w:r>
               <w:rPr>
+                <w:strike w:val="1"/>
                 <w:rtl w:val="0"/>
               </w:rPr>
             </w:r>
@@ -4006,6 +4006,221 @@
         <w:rPr>
           <w:rtl w:val="0"/>
         </w:rPr>
+      </w:r>
+    </w:p>
+    <w:p>
+      <w:pPr>
+        <w:keepLines w:val="0"/>
+        <w:spacing w:line="360" w:lineRule="auto"/>
+        <w:rPr>
+          <w:rFonts w:ascii="Google Sans" w:cs="Google Sans" w:eastAsia="Google Sans" w:hAnsi="Google Sans"/>
+          <w:sz w:val="24"/>
+          <w:szCs w:val="24"/>
+        </w:rPr>
+      </w:pPr>
+      <w:r>
+        <w:rPr>
+          <w:rtl w:val="0"/>
+        </w:rPr>
+      </w:r>
+    </w:p>
+    <w:p>
+      <w:pPr>
+        <w:keepLines w:val="0"/>
+        <w:spacing w:line="360" w:lineRule="auto"/>
+        <w:rPr>
+          <w:rFonts w:ascii="Google Sans" w:cs="Google Sans" w:eastAsia="Google Sans" w:hAnsi="Google Sans"/>
+          <w:sz w:val="24"/>
+          <w:szCs w:val="24"/>
+        </w:rPr>
+      </w:pPr>
+      <w:r>
+        <w:rPr>
+          <w:rFonts w:ascii="Google Sans" w:cs="Google Sans" w:eastAsia="Google Sans" w:hAnsi="Google Sans"/>
+          <w:sz w:val="24"/>
+          <w:szCs w:val="24"/>
+          <w:rtl w:val="0"/>
+        </w:rPr>
+        <w:t xml:space="preserve">Multiple controls need to be implemented to improve Botium Toys' security posture</w:t>
+      </w:r>
+    </w:p>
+    <w:p>
+      <w:pPr>
+        <w:keepLines w:val="0"/>
+        <w:spacing w:line="360" w:lineRule="auto"/>
+        <w:rPr>
+          <w:rFonts w:ascii="Google Sans" w:cs="Google Sans" w:eastAsia="Google Sans" w:hAnsi="Google Sans"/>
+          <w:sz w:val="24"/>
+          <w:szCs w:val="24"/>
+        </w:rPr>
+      </w:pPr>
+      <w:r>
+        <w:rPr>
+          <w:rFonts w:ascii="Google Sans" w:cs="Google Sans" w:eastAsia="Google Sans" w:hAnsi="Google Sans"/>
+          <w:sz w:val="24"/>
+          <w:szCs w:val="24"/>
+          <w:rtl w:val="0"/>
+        </w:rPr>
+        <w:t xml:space="preserve">and better ensure the confidentiality of sensitive information, including: Least</w:t>
+      </w:r>
+    </w:p>
+    <w:p>
+      <w:pPr>
+        <w:keepLines w:val="0"/>
+        <w:spacing w:line="360" w:lineRule="auto"/>
+        <w:rPr>
+          <w:rFonts w:ascii="Google Sans" w:cs="Google Sans" w:eastAsia="Google Sans" w:hAnsi="Google Sans"/>
+          <w:sz w:val="24"/>
+          <w:szCs w:val="24"/>
+        </w:rPr>
+      </w:pPr>
+      <w:r>
+        <w:rPr>
+          <w:rFonts w:ascii="Google Sans" w:cs="Google Sans" w:eastAsia="Google Sans" w:hAnsi="Google Sans"/>
+          <w:sz w:val="24"/>
+          <w:szCs w:val="24"/>
+          <w:rtl w:val="0"/>
+        </w:rPr>
+        <w:t xml:space="preserve">Privilege, disaster recovery plans, password policies, separation of duties, an IDS,</w:t>
+      </w:r>
+    </w:p>
+    <w:p>
+      <w:pPr>
+        <w:keepLines w:val="0"/>
+        <w:spacing w:line="360" w:lineRule="auto"/>
+        <w:rPr>
+          <w:rFonts w:ascii="Google Sans" w:cs="Google Sans" w:eastAsia="Google Sans" w:hAnsi="Google Sans"/>
+          <w:sz w:val="24"/>
+          <w:szCs w:val="24"/>
+        </w:rPr>
+      </w:pPr>
+      <w:r>
+        <w:rPr>
+          <w:rFonts w:ascii="Google Sans" w:cs="Google Sans" w:eastAsia="Google Sans" w:hAnsi="Google Sans"/>
+          <w:sz w:val="24"/>
+          <w:szCs w:val="24"/>
+          <w:rtl w:val="0"/>
+        </w:rPr>
+        <w:t xml:space="preserve">ongoing legacy system management, encryption, and a password management</w:t>
+      </w:r>
+    </w:p>
+    <w:p>
+      <w:pPr>
+        <w:keepLines w:val="0"/>
+        <w:spacing w:line="360" w:lineRule="auto"/>
+        <w:rPr>
+          <w:rFonts w:ascii="Google Sans" w:cs="Google Sans" w:eastAsia="Google Sans" w:hAnsi="Google Sans"/>
+          <w:sz w:val="24"/>
+          <w:szCs w:val="24"/>
+        </w:rPr>
+      </w:pPr>
+      <w:r>
+        <w:rPr>
+          <w:rFonts w:ascii="Google Sans" w:cs="Google Sans" w:eastAsia="Google Sans" w:hAnsi="Google Sans"/>
+          <w:sz w:val="24"/>
+          <w:szCs w:val="24"/>
+          <w:rtl w:val="0"/>
+        </w:rPr>
+        <w:t xml:space="preserve">system.</w:t>
+      </w:r>
+    </w:p>
+    <w:p>
+      <w:pPr>
+        <w:keepLines w:val="0"/>
+        <w:spacing w:line="360" w:lineRule="auto"/>
+        <w:rPr>
+          <w:rFonts w:ascii="Google Sans" w:cs="Google Sans" w:eastAsia="Google Sans" w:hAnsi="Google Sans"/>
+          <w:sz w:val="24"/>
+          <w:szCs w:val="24"/>
+        </w:rPr>
+      </w:pPr>
+      <w:r>
+        <w:rPr>
+          <w:rFonts w:ascii="Google Sans" w:cs="Google Sans" w:eastAsia="Google Sans" w:hAnsi="Google Sans"/>
+          <w:sz w:val="24"/>
+          <w:szCs w:val="24"/>
+          <w:rtl w:val="0"/>
+        </w:rPr>
+        <w:t xml:space="preserve">To address gaps in compliance, Botium Toys needs to implement controls such as</w:t>
+      </w:r>
+    </w:p>
+    <w:p>
+      <w:pPr>
+        <w:keepLines w:val="0"/>
+        <w:spacing w:line="360" w:lineRule="auto"/>
+        <w:rPr>
+          <w:rFonts w:ascii="Google Sans" w:cs="Google Sans" w:eastAsia="Google Sans" w:hAnsi="Google Sans"/>
+          <w:sz w:val="24"/>
+          <w:szCs w:val="24"/>
+        </w:rPr>
+      </w:pPr>
+      <w:r>
+        <w:rPr>
+          <w:rFonts w:ascii="Google Sans" w:cs="Google Sans" w:eastAsia="Google Sans" w:hAnsi="Google Sans"/>
+          <w:sz w:val="24"/>
+          <w:szCs w:val="24"/>
+          <w:rtl w:val="0"/>
+        </w:rPr>
+        <w:t xml:space="preserve">Least Privilege, separation of duties, and encryption. The company also needs to</w:t>
+      </w:r>
+    </w:p>
+    <w:p>
+      <w:pPr>
+        <w:keepLines w:val="0"/>
+        <w:spacing w:line="360" w:lineRule="auto"/>
+        <w:rPr>
+          <w:rFonts w:ascii="Google Sans" w:cs="Google Sans" w:eastAsia="Google Sans" w:hAnsi="Google Sans"/>
+          <w:sz w:val="24"/>
+          <w:szCs w:val="24"/>
+        </w:rPr>
+      </w:pPr>
+      <w:r>
+        <w:rPr>
+          <w:rFonts w:ascii="Google Sans" w:cs="Google Sans" w:eastAsia="Google Sans" w:hAnsi="Google Sans"/>
+          <w:sz w:val="24"/>
+          <w:szCs w:val="24"/>
+          <w:rtl w:val="0"/>
+        </w:rPr>
+        <w:t xml:space="preserve">properly classify assets, to identify additional controls that may need to be</w:t>
+      </w:r>
+    </w:p>
+    <w:p>
+      <w:pPr>
+        <w:keepLines w:val="0"/>
+        <w:spacing w:line="360" w:lineRule="auto"/>
+        <w:rPr>
+          <w:rFonts w:ascii="Google Sans" w:cs="Google Sans" w:eastAsia="Google Sans" w:hAnsi="Google Sans"/>
+          <w:sz w:val="24"/>
+          <w:szCs w:val="24"/>
+        </w:rPr>
+      </w:pPr>
+      <w:r>
+        <w:rPr>
+          <w:rFonts w:ascii="Google Sans" w:cs="Google Sans" w:eastAsia="Google Sans" w:hAnsi="Google Sans"/>
+          <w:sz w:val="24"/>
+          <w:szCs w:val="24"/>
+          <w:rtl w:val="0"/>
+        </w:rPr>
+        <w:t xml:space="preserve">implemented to improve their security posture and better protect sensitive</w:t>
+      </w:r>
+    </w:p>
+    <w:p>
+      <w:pPr>
+        <w:keepLines w:val="0"/>
+        <w:rPr>
+          <w:rFonts w:ascii="Google Sans" w:cs="Google Sans" w:eastAsia="Google Sans" w:hAnsi="Google Sans"/>
+          <w:sz w:val="24"/>
+          <w:szCs w:val="24"/>
+        </w:rPr>
+      </w:pPr>
+      <w:r>
+        <w:rPr>
+          <w:rFonts w:ascii="Google Sans" w:cs="Google Sans" w:eastAsia="Google Sans" w:hAnsi="Google Sans"/>
+          <w:sz w:val="24"/>
+          <w:szCs w:val="24"/>
+          <w:rtl w:val="0"/>
+        </w:rPr>
+        <w:t xml:space="preserve">information.</w:t>
       </w:r>
     </w:p>
     <w:p>

</xml_diff>